<commit_message>
Update RTA - Validação de Setup Computacional V3 document with new changes
</commit_message>
<xml_diff>
--- a/docs/RTA - Validação de Setup Computacional V3.docx
+++ b/docs/RTA - Validação de Setup Computacional V3.docx
@@ -238,21 +238,7 @@
                 <w:rFonts w:eastAsia="Arial" w:cs="Arial"/>
                 <w:shd w:fill="auto" w:val="clear"/>
               </w:rPr>
-              <w:t xml:space="preserve">BIG O (Samuel </w:t>
-            </w:r>
-            <w:r>
-              <w:rPr>
-                <w:rFonts w:eastAsia="Arial" w:cs="Arial"/>
-                <w:shd w:fill="auto" w:val="clear"/>
-              </w:rPr>
-              <w:t>Cesar</w:t>
-            </w:r>
-            <w:r>
-              <w:rPr>
-                <w:rFonts w:eastAsia="Arial" w:cs="Arial"/>
-                <w:shd w:fill="auto" w:val="clear"/>
-              </w:rPr>
-              <w:t>, Pedro Henrique e Pedro Lucas)</w:t>
+              <w:t>BIG O (Samuel Cesar, Pedro Henrique e Pedro Lucas)</w:t>
             </w:r>
           </w:p>
         </w:tc>
@@ -902,8 +888,8 @@
       <w:tblGrid>
         <w:gridCol w:w="1337"/>
         <w:gridCol w:w="1337"/>
-        <w:gridCol w:w="1334"/>
-        <w:gridCol w:w="3"/>
+        <w:gridCol w:w="1333"/>
+        <w:gridCol w:w="4"/>
         <w:gridCol w:w="1337"/>
         <w:gridCol w:w="1335"/>
         <w:gridCol w:w="2"/>
@@ -955,7 +941,7 @@
         </w:tc>
         <w:tc>
           <w:tcPr>
-            <w:tcW w:w="2671" w:type="dxa"/>
+            <w:tcW w:w="2670" w:type="dxa"/>
             <w:gridSpan w:val="2"/>
             <w:tcBorders>
               <w:top w:val="single" w:sz="6" w:space="0" w:color="000000"/>
@@ -987,7 +973,7 @@
         </w:tc>
         <w:tc>
           <w:tcPr>
-            <w:tcW w:w="2675" w:type="dxa"/>
+            <w:tcW w:w="2676" w:type="dxa"/>
             <w:gridSpan w:val="3"/>
             <w:tcBorders>
               <w:top w:val="single" w:sz="6" w:space="0" w:color="000000"/>
@@ -2046,21 +2032,7 @@
                 <w:spacing w:val="0"/>
                 <w:sz w:val="21"/>
               </w:rPr>
-              <w:t>x10⁴</w:t>
-            </w:r>
-            <w:r>
-              <w:rPr>
-                <w:rFonts w:eastAsia="Arial" w:cs="Arial" w:ascii="Droid Sans Mono;monospace" w:hAnsi="Droid Sans Mono;monospace"/>
-                <w:b/>
-                <w:bCs/>
-                <w:i w:val="false"/>
-                <w:caps w:val="false"/>
-                <w:smallCaps w:val="false"/>
-                <w:color w:val="C9211E"/>
-                <w:spacing w:val="0"/>
-                <w:sz w:val="21"/>
-              </w:rPr>
-              <w:t> </w:t>
+              <w:t>x10⁴ </w:t>
             </w:r>
           </w:p>
         </w:tc>
@@ -3762,7 +3734,7 @@
           <w:b w:val="false"/>
           <w:bCs w:val="false"/>
         </w:rPr>
-        <w:t>Garantindo assim a instabilidades com essas instruções sendo seguidas.</w:t>
+        <w:t>Garantindo assim a estabilidade com essas instruções sendo seguidas.</w:t>
       </w:r>
     </w:p>
     <w:sectPr>

</xml_diff>